<commit_message>
conexion test a nextcloud
</commit_message>
<xml_diff>
--- a/Calidad/RG-10. Ofertas. Ed 03/CSS_RG-10. Oferta Ed.05_ES.docx
+++ b/Calidad/RG-10. Ofertas. Ed 03/CSS_RG-10. Oferta Ed.05_ES.docx
@@ -1,6 +1,6 @@
 
 <file path=word/document.xml><?xml version="1.0" encoding="utf-8"?>
-<w:document xmlns:wpc="http://schemas.microsoft.com/office/word/2010/wordprocessingCanvas" xmlns:cx="http://schemas.microsoft.com/office/drawing/2014/chartex" xmlns:cx1="http://schemas.microsoft.com/office/drawing/2015/9/8/chartex" xmlns:cx2="http://schemas.microsoft.com/office/drawing/2015/10/21/chartex" xmlns:cx3="http://schemas.microsoft.com/office/drawing/2016/5/9/chartex" xmlns:cx4="http://schemas.microsoft.com/office/drawing/2016/5/10/chartex" xmlns:cx5="http://schemas.microsoft.com/office/drawing/2016/5/11/chartex" xmlns:cx6="http://schemas.microsoft.com/office/drawing/2016/5/12/chartex" xmlns:cx7="http://schemas.microsoft.com/office/drawing/2016/5/13/chartex" xmlns:cx8="http://schemas.microsoft.com/office/drawing/2016/5/14/chartex" xmlns:mc="http://schemas.openxmlformats.org/markup-compatibility/2006" xmlns:aink="http://schemas.microsoft.com/office/drawing/2016/ink" xmlns:am3d="http://schemas.microsoft.com/office/drawing/2017/model3d" xmlns:o="urn:schemas-microsoft-com:office:office" xmlns:r="http://schemas.openxmlformats.org/officeDocument/2006/relationships" xmlns:m="http://schemas.openxmlformats.org/officeDocument/2006/math" xmlns:v="urn:schemas-microsoft-com:vml" xmlns:wp14="http://schemas.microsoft.com/office/word/2010/wordprocessingDrawing" xmlns:wp="http://schemas.openxmlformats.org/drawingml/2006/wordprocessingDrawing" xmlns:w10="urn:schemas-microsoft-com:office:word" xmlns:w="http://schemas.openxmlformats.org/wordprocessingml/2006/main" xmlns:w14="http://schemas.microsoft.com/office/word/2010/wordml" xmlns:w15="http://schemas.microsoft.com/office/word/2012/wordml" xmlns:w16cex="http://schemas.microsoft.com/office/word/2018/wordml/cex" xmlns:w16cid="http://schemas.microsoft.com/office/word/2016/wordml/cid" xmlns:w16="http://schemas.microsoft.com/office/word/2018/wordml" xmlns:w16sdtdh="http://schemas.microsoft.com/office/word/2020/wordml/sdtdatahash" xmlns:w16se="http://schemas.microsoft.com/office/word/2015/wordml/symex" xmlns:wpg="http://schemas.microsoft.com/office/word/2010/wordprocessingGroup" xmlns:wpi="http://schemas.microsoft.com/office/word/2010/wordprocessingInk" xmlns:wne="http://schemas.microsoft.com/office/word/2006/wordml" xmlns:wps="http://schemas.microsoft.com/office/word/2010/wordprocessingShape" mc:Ignorable="w14 w15 w16se w16cid w16 w16cex w16sdtdh wp14">
+<w:document xmlns:wpc="http://schemas.microsoft.com/office/word/2010/wordprocessingCanvas" xmlns:cx="http://schemas.microsoft.com/office/drawing/2014/chartex" xmlns:cx1="http://schemas.microsoft.com/office/drawing/2015/9/8/chartex" xmlns:cx2="http://schemas.microsoft.com/office/drawing/2015/10/21/chartex" xmlns:cx3="http://schemas.microsoft.com/office/drawing/2016/5/9/chartex" xmlns:cx4="http://schemas.microsoft.com/office/drawing/2016/5/10/chartex" xmlns:cx5="http://schemas.microsoft.com/office/drawing/2016/5/11/chartex" xmlns:cx6="http://schemas.microsoft.com/office/drawing/2016/5/12/chartex" xmlns:cx7="http://schemas.microsoft.com/office/drawing/2016/5/13/chartex" xmlns:cx8="http://schemas.microsoft.com/office/drawing/2016/5/14/chartex" xmlns:mc="http://schemas.openxmlformats.org/markup-compatibility/2006" xmlns:aink="http://schemas.microsoft.com/office/drawing/2016/ink" xmlns:am3d="http://schemas.microsoft.com/office/drawing/2017/model3d" xmlns:o="urn:schemas-microsoft-com:office:office" xmlns:oel="http://schemas.microsoft.com/office/2019/extlst" xmlns:r="http://schemas.openxmlformats.org/officeDocument/2006/relationships" xmlns:m="http://schemas.openxmlformats.org/officeDocument/2006/math" xmlns:v="urn:schemas-microsoft-com:vml" xmlns:wp14="http://schemas.microsoft.com/office/word/2010/wordprocessingDrawing" xmlns:wp="http://schemas.openxmlformats.org/drawingml/2006/wordprocessingDrawing" xmlns:w10="urn:schemas-microsoft-com:office:word" xmlns:w="http://schemas.openxmlformats.org/wordprocessingml/2006/main" xmlns:w14="http://schemas.microsoft.com/office/word/2010/wordml" xmlns:w15="http://schemas.microsoft.com/office/word/2012/wordml" xmlns:w16cex="http://schemas.microsoft.com/office/word/2018/wordml/cex" xmlns:w16cid="http://schemas.microsoft.com/office/word/2016/wordml/cid" xmlns:w16="http://schemas.microsoft.com/office/word/2018/wordml" xmlns:w16sdtdh="http://schemas.microsoft.com/office/word/2020/wordml/sdtdatahash" xmlns:w16se="http://schemas.microsoft.com/office/word/2015/wordml/symex" xmlns:wpg="http://schemas.microsoft.com/office/word/2010/wordprocessingGroup" xmlns:wpi="http://schemas.microsoft.com/office/word/2010/wordprocessingInk" xmlns:wne="http://schemas.microsoft.com/office/word/2006/wordml" xmlns:wps="http://schemas.microsoft.com/office/word/2010/wordprocessingShape" mc:Ignorable="w14 w15 w16se w16cid w16 w16cex w16sdtdh wp14">
   <w:body>
     <w:p>
       <w:pPr>
@@ -356,12 +356,14 @@
         <w:rPr>
           <w:rFonts w:ascii="Calibri" w:hAnsi="Calibri" w:cs="Tahoma"/>
           <w:b/>
+          <w:lang w:val="en-US"/>
         </w:rPr>
       </w:pPr>
       <w:r>
         <w:rPr>
           <w:rFonts w:ascii="Calibri" w:hAnsi="Calibri" w:cs="Tahoma"/>
           <w:b/>
+          <w:lang w:val="en-US"/>
         </w:rPr>
         <w:t xml:space="preserve">LA ACEPTACIÓN DE LA OFERTA IMPLICA INCLUIR EN LOS AGRADECIMIENTOS LOS SERVICIOS PRESTADOS POR MiNa, AÑADIENDO EN LA PUBLICACIÓN, COMUNICACIÓN O TESIS, LA FRASE: </w:t>
       </w:r>
@@ -370,203 +372,42 @@
         <w:rPr>
           <w:rFonts w:ascii="Calibri" w:hAnsi="Calibri" w:cs="Tahoma"/>
           <w:b/>
+          <w:lang w:val="en-US"/>
         </w:rPr>
         <w:t>“</w:t>
-      </w:r>
-      <w:proofErr w:type="spellStart"/>
-      <w:r>
-        <w:rPr>
-          <w:rFonts w:ascii="Calibri" w:hAnsi="Calibri" w:cs="Tahoma"/>
-          <w:b/>
-        </w:rPr>
-        <w:t>We</w:t>
-      </w:r>
-      <w:proofErr w:type="spellEnd"/>
-      <w:r>
-        <w:rPr>
-          <w:rFonts w:ascii="Calibri" w:hAnsi="Calibri" w:cs="Tahoma"/>
-          <w:b/>
-        </w:rPr>
-        <w:t xml:space="preserve"> </w:t>
-      </w:r>
-      <w:proofErr w:type="spellStart"/>
-      <w:r>
-        <w:rPr>
-          <w:rFonts w:ascii="Calibri" w:hAnsi="Calibri" w:cs="Tahoma"/>
-          <w:b/>
-        </w:rPr>
-        <w:t>acknowledge</w:t>
-      </w:r>
-      <w:proofErr w:type="spellEnd"/>
-      <w:r>
-        <w:rPr>
-          <w:rFonts w:ascii="Calibri" w:hAnsi="Calibri" w:cs="Tahoma"/>
-          <w:b/>
-        </w:rPr>
-        <w:t xml:space="preserve"> </w:t>
-      </w:r>
-      <w:proofErr w:type="spellStart"/>
-      <w:r>
-        <w:rPr>
-          <w:rFonts w:ascii="Calibri" w:hAnsi="Calibri" w:cs="Tahoma"/>
-          <w:b/>
-        </w:rPr>
-        <w:t>the</w:t>
-      </w:r>
-      <w:proofErr w:type="spellEnd"/>
-      <w:r>
-        <w:rPr>
-          <w:rFonts w:ascii="Calibri" w:hAnsi="Calibri" w:cs="Tahoma"/>
-          <w:b/>
-        </w:rPr>
-        <w:t xml:space="preserve"> </w:t>
-      </w:r>
-      <w:proofErr w:type="spellStart"/>
-      <w:r>
-        <w:rPr>
-          <w:rFonts w:ascii="Calibri" w:hAnsi="Calibri" w:cs="Tahoma"/>
-          <w:b/>
-        </w:rPr>
-        <w:t>service</w:t>
-      </w:r>
-      <w:proofErr w:type="spellEnd"/>
-      <w:r>
-        <w:rPr>
-          <w:rFonts w:ascii="Calibri" w:hAnsi="Calibri" w:cs="Tahoma"/>
-          <w:b/>
-        </w:rPr>
-        <w:t xml:space="preserve"> </w:t>
-      </w:r>
-      <w:proofErr w:type="spellStart"/>
-      <w:r>
-        <w:rPr>
-          <w:rFonts w:ascii="Calibri" w:hAnsi="Calibri" w:cs="Tahoma"/>
-          <w:b/>
-        </w:rPr>
-        <w:t>from</w:t>
-      </w:r>
-      <w:proofErr w:type="spellEnd"/>
-      <w:r>
-        <w:rPr>
-          <w:rFonts w:ascii="Calibri" w:hAnsi="Calibri" w:cs="Tahoma"/>
-          <w:b/>
-        </w:rPr>
-        <w:t xml:space="preserve"> </w:t>
-      </w:r>
-      <w:proofErr w:type="spellStart"/>
-      <w:r>
-        <w:rPr>
-          <w:rFonts w:ascii="Calibri" w:hAnsi="Calibri" w:cs="Tahoma"/>
-          <w:b/>
-        </w:rPr>
-        <w:t>the</w:t>
-      </w:r>
-      <w:proofErr w:type="spellEnd"/>
-      <w:r>
-        <w:rPr>
-          <w:rFonts w:ascii="Calibri" w:hAnsi="Calibri" w:cs="Tahoma"/>
-          <w:b/>
-        </w:rPr>
-        <w:t xml:space="preserve"> </w:t>
-      </w:r>
-      <w:proofErr w:type="spellStart"/>
-      <w:r>
-        <w:rPr>
-          <w:rFonts w:ascii="Calibri" w:hAnsi="Calibri" w:cs="Tahoma"/>
-          <w:b/>
-        </w:rPr>
-        <w:t>MiNa</w:t>
-      </w:r>
-      <w:proofErr w:type="spellEnd"/>
-      <w:r>
-        <w:rPr>
-          <w:rFonts w:ascii="Calibri" w:hAnsi="Calibri" w:cs="Tahoma"/>
-          <w:b/>
-        </w:rPr>
-        <w:t xml:space="preserve"> </w:t>
-      </w:r>
-      <w:proofErr w:type="spellStart"/>
-      <w:r>
-        <w:rPr>
-          <w:rFonts w:ascii="Calibri" w:hAnsi="Calibri" w:cs="Tahoma"/>
-          <w:b/>
-        </w:rPr>
-        <w:t>Laboratory</w:t>
-      </w:r>
-      <w:proofErr w:type="spellEnd"/>
-      <w:r>
-        <w:rPr>
-          <w:rFonts w:ascii="Calibri" w:hAnsi="Calibri" w:cs="Tahoma"/>
-          <w:b/>
-        </w:rPr>
-        <w:t xml:space="preserve"> at IMN, and </w:t>
-      </w:r>
-      <w:proofErr w:type="spellStart"/>
-      <w:r>
-        <w:rPr>
-          <w:rFonts w:ascii="Calibri" w:hAnsi="Calibri" w:cs="Tahoma"/>
-          <w:b/>
-        </w:rPr>
-        <w:t>funding</w:t>
-      </w:r>
-      <w:proofErr w:type="spellEnd"/>
-      <w:r>
-        <w:rPr>
-          <w:rFonts w:ascii="Calibri" w:hAnsi="Calibri" w:cs="Tahoma"/>
-          <w:b/>
-        </w:rPr>
-        <w:t xml:space="preserve"> </w:t>
-      </w:r>
-      <w:proofErr w:type="spellStart"/>
-      <w:r>
-        <w:rPr>
-          <w:rFonts w:ascii="Calibri" w:hAnsi="Calibri" w:cs="Tahoma"/>
-          <w:b/>
-        </w:rPr>
-        <w:t>from</w:t>
-      </w:r>
-      <w:proofErr w:type="spellEnd"/>
-      <w:r>
-        <w:rPr>
-          <w:rFonts w:ascii="Calibri" w:hAnsi="Calibri" w:cs="Tahoma"/>
-          <w:b/>
-        </w:rPr>
-        <w:t xml:space="preserve"> EU (FEDER, FSE), </w:t>
       </w:r>
       <w:r>
         <w:rPr>
           <w:rFonts w:ascii="Calibri" w:hAnsi="Calibri" w:cs="Tahoma"/>
           <w:b/>
+          <w:bCs/>
+          <w:lang w:val="en-US"/>
         </w:rPr>
-        <w:t>MCIN/AEI/10.13039/501100011033</w:t>
+        <w:t xml:space="preserve">We acknowledge the services provided by the MiNa Laboratory at IMN-CNM, CSIC, as well as the funding received from the European Union (FEDER, FSE), MCIN/AEI/10.13039/501100011033, NextGenerationEU/PRTR (EQC2021-006944-P), the MicroNanoSpain project, funded by the European Union through the Chips Joint Undertaking (Chips JU), Grant Agreement No. 101217813, and by the Spanish Ministry for Digital Transformation and Civil Service (CJU-010100-2025-5t), and PRTR C17.I02 </w:t>
       </w:r>
       <w:r>
         <w:rPr>
           <w:rFonts w:ascii="Calibri" w:hAnsi="Calibri" w:cs="Tahoma"/>
           <w:b/>
+          <w:bCs/>
+          <w:lang w:val="en-US"/>
         </w:rPr>
-        <w:t xml:space="preserve"> and Next </w:t>
-      </w:r>
-      <w:proofErr w:type="spellStart"/>
-      <w:r>
-        <w:rPr>
-          <w:rFonts w:ascii="Calibri" w:hAnsi="Calibri" w:cs="Tahoma"/>
-          <w:b/>
-        </w:rPr>
-        <w:t>Generation</w:t>
-      </w:r>
-      <w:proofErr w:type="spellEnd"/>
-      <w:r>
-        <w:rPr>
-          <w:rFonts w:ascii="Calibri" w:hAnsi="Calibri" w:cs="Tahoma"/>
-          <w:b/>
-        </w:rPr>
-        <w:t xml:space="preserve"> EU/PRTR (EQC2021-006944-P)”</w:t>
+        <w:lastRenderedPageBreak/>
+        <w:t>PERTE Chip – Microelectronics and Semiconductors, Clean Rooms – IMN Action (MICRO24002), funded by the European Union through the Recovery and Resilience Facility</w:t>
       </w:r>
       <w:r>
         <w:rPr>
           <w:rFonts w:ascii="Calibri" w:hAnsi="Calibri" w:cs="Tahoma"/>
           <w:b/>
+          <w:lang w:val="en-US"/>
+        </w:rPr>
+        <w:t>”</w:t>
+      </w:r>
+      <w:r>
+        <w:rPr>
+          <w:rFonts w:ascii="Calibri" w:hAnsi="Calibri" w:cs="Tahoma"/>
+          <w:b/>
+          <w:lang w:val="en-US"/>
         </w:rPr>
         <w:t>.</w:t>
       </w:r>
@@ -581,6 +422,7 @@
           <w:b/>
           <w:sz w:val="22"/>
           <w:szCs w:val="22"/>
+          <w:lang w:val="en-US"/>
         </w:rPr>
       </w:pPr>
     </w:p>
@@ -597,7 +439,7 @@
 </file>
 
 <file path=word/endnotes.xml><?xml version="1.0" encoding="utf-8"?>
-<w:endnotes xmlns:wpc="http://schemas.microsoft.com/office/word/2010/wordprocessingCanvas" xmlns:cx="http://schemas.microsoft.com/office/drawing/2014/chartex" xmlns:cx1="http://schemas.microsoft.com/office/drawing/2015/9/8/chartex" xmlns:cx2="http://schemas.microsoft.com/office/drawing/2015/10/21/chartex" xmlns:cx3="http://schemas.microsoft.com/office/drawing/2016/5/9/chartex" xmlns:cx4="http://schemas.microsoft.com/office/drawing/2016/5/10/chartex" xmlns:cx5="http://schemas.microsoft.com/office/drawing/2016/5/11/chartex" xmlns:cx6="http://schemas.microsoft.com/office/drawing/2016/5/12/chartex" xmlns:cx7="http://schemas.microsoft.com/office/drawing/2016/5/13/chartex" xmlns:cx8="http://schemas.microsoft.com/office/drawing/2016/5/14/chartex" xmlns:mc="http://schemas.openxmlformats.org/markup-compatibility/2006" xmlns:aink="http://schemas.microsoft.com/office/drawing/2016/ink" xmlns:am3d="http://schemas.microsoft.com/office/drawing/2017/model3d" xmlns:o="urn:schemas-microsoft-com:office:office" xmlns:r="http://schemas.openxmlformats.org/officeDocument/2006/relationships" xmlns:m="http://schemas.openxmlformats.org/officeDocument/2006/math" xmlns:v="urn:schemas-microsoft-com:vml" xmlns:wp14="http://schemas.microsoft.com/office/word/2010/wordprocessingDrawing" xmlns:wp="http://schemas.openxmlformats.org/drawingml/2006/wordprocessingDrawing" xmlns:w10="urn:schemas-microsoft-com:office:word" xmlns:w="http://schemas.openxmlformats.org/wordprocessingml/2006/main" xmlns:w14="http://schemas.microsoft.com/office/word/2010/wordml" xmlns:w15="http://schemas.microsoft.com/office/word/2012/wordml" xmlns:w16cex="http://schemas.microsoft.com/office/word/2018/wordml/cex" xmlns:w16cid="http://schemas.microsoft.com/office/word/2016/wordml/cid" xmlns:w16="http://schemas.microsoft.com/office/word/2018/wordml" xmlns:w16sdtdh="http://schemas.microsoft.com/office/word/2020/wordml/sdtdatahash" xmlns:w16se="http://schemas.microsoft.com/office/word/2015/wordml/symex" xmlns:wpg="http://schemas.microsoft.com/office/word/2010/wordprocessingGroup" xmlns:wpi="http://schemas.microsoft.com/office/word/2010/wordprocessingInk" xmlns:wne="http://schemas.microsoft.com/office/word/2006/wordml" xmlns:wps="http://schemas.microsoft.com/office/word/2010/wordprocessingShape" mc:Ignorable="w14 w15 w16se w16cid w16 w16cex w16sdtdh wp14">
+<w:endnotes xmlns:wpc="http://schemas.microsoft.com/office/word/2010/wordprocessingCanvas" xmlns:cx="http://schemas.microsoft.com/office/drawing/2014/chartex" xmlns:cx1="http://schemas.microsoft.com/office/drawing/2015/9/8/chartex" xmlns:cx2="http://schemas.microsoft.com/office/drawing/2015/10/21/chartex" xmlns:cx3="http://schemas.microsoft.com/office/drawing/2016/5/9/chartex" xmlns:cx4="http://schemas.microsoft.com/office/drawing/2016/5/10/chartex" xmlns:cx5="http://schemas.microsoft.com/office/drawing/2016/5/11/chartex" xmlns:cx6="http://schemas.microsoft.com/office/drawing/2016/5/12/chartex" xmlns:cx7="http://schemas.microsoft.com/office/drawing/2016/5/13/chartex" xmlns:cx8="http://schemas.microsoft.com/office/drawing/2016/5/14/chartex" xmlns:mc="http://schemas.openxmlformats.org/markup-compatibility/2006" xmlns:aink="http://schemas.microsoft.com/office/drawing/2016/ink" xmlns:am3d="http://schemas.microsoft.com/office/drawing/2017/model3d" xmlns:o="urn:schemas-microsoft-com:office:office" xmlns:oel="http://schemas.microsoft.com/office/2019/extlst" xmlns:r="http://schemas.openxmlformats.org/officeDocument/2006/relationships" xmlns:m="http://schemas.openxmlformats.org/officeDocument/2006/math" xmlns:v="urn:schemas-microsoft-com:vml" xmlns:wp14="http://schemas.microsoft.com/office/word/2010/wordprocessingDrawing" xmlns:wp="http://schemas.openxmlformats.org/drawingml/2006/wordprocessingDrawing" xmlns:w10="urn:schemas-microsoft-com:office:word" xmlns:w="http://schemas.openxmlformats.org/wordprocessingml/2006/main" xmlns:w14="http://schemas.microsoft.com/office/word/2010/wordml" xmlns:w15="http://schemas.microsoft.com/office/word/2012/wordml" xmlns:w16cex="http://schemas.microsoft.com/office/word/2018/wordml/cex" xmlns:w16cid="http://schemas.microsoft.com/office/word/2016/wordml/cid" xmlns:w16="http://schemas.microsoft.com/office/word/2018/wordml" xmlns:w16sdtdh="http://schemas.microsoft.com/office/word/2020/wordml/sdtdatahash" xmlns:w16se="http://schemas.microsoft.com/office/word/2015/wordml/symex" xmlns:wpg="http://schemas.microsoft.com/office/word/2010/wordprocessingGroup" xmlns:wpi="http://schemas.microsoft.com/office/word/2010/wordprocessingInk" xmlns:wne="http://schemas.microsoft.com/office/word/2006/wordml" xmlns:wps="http://schemas.microsoft.com/office/word/2010/wordprocessingShape" mc:Ignorable="w14 w15 w16se w16cid w16 w16cex w16sdtdh wp14">
   <w:endnote w:type="separator" w:id="-1">
     <w:p>
       <w:r>
@@ -616,7 +458,7 @@
 </file>
 
 <file path=word/footer1.xml><?xml version="1.0" encoding="utf-8"?>
-<w:ftr xmlns:wpc="http://schemas.microsoft.com/office/word/2010/wordprocessingCanvas" xmlns:cx="http://schemas.microsoft.com/office/drawing/2014/chartex" xmlns:cx1="http://schemas.microsoft.com/office/drawing/2015/9/8/chartex" xmlns:cx2="http://schemas.microsoft.com/office/drawing/2015/10/21/chartex" xmlns:cx3="http://schemas.microsoft.com/office/drawing/2016/5/9/chartex" xmlns:cx4="http://schemas.microsoft.com/office/drawing/2016/5/10/chartex" xmlns:cx5="http://schemas.microsoft.com/office/drawing/2016/5/11/chartex" xmlns:cx6="http://schemas.microsoft.com/office/drawing/2016/5/12/chartex" xmlns:cx7="http://schemas.microsoft.com/office/drawing/2016/5/13/chartex" xmlns:cx8="http://schemas.microsoft.com/office/drawing/2016/5/14/chartex" xmlns:mc="http://schemas.openxmlformats.org/markup-compatibility/2006" xmlns:aink="http://schemas.microsoft.com/office/drawing/2016/ink" xmlns:am3d="http://schemas.microsoft.com/office/drawing/2017/model3d" xmlns:o="urn:schemas-microsoft-com:office:office" xmlns:r="http://schemas.openxmlformats.org/officeDocument/2006/relationships" xmlns:m="http://schemas.openxmlformats.org/officeDocument/2006/math" xmlns:v="urn:schemas-microsoft-com:vml" xmlns:wp14="http://schemas.microsoft.com/office/word/2010/wordprocessingDrawing" xmlns:wp="http://schemas.openxmlformats.org/drawingml/2006/wordprocessingDrawing" xmlns:w10="urn:schemas-microsoft-com:office:word" xmlns:w="http://schemas.openxmlformats.org/wordprocessingml/2006/main" xmlns:w14="http://schemas.microsoft.com/office/word/2010/wordml" xmlns:w15="http://schemas.microsoft.com/office/word/2012/wordml" xmlns:w16cex="http://schemas.microsoft.com/office/word/2018/wordml/cex" xmlns:w16cid="http://schemas.microsoft.com/office/word/2016/wordml/cid" xmlns:w16="http://schemas.microsoft.com/office/word/2018/wordml" xmlns:w16sdtdh="http://schemas.microsoft.com/office/word/2020/wordml/sdtdatahash" xmlns:w16se="http://schemas.microsoft.com/office/word/2015/wordml/symex" xmlns:wpg="http://schemas.microsoft.com/office/word/2010/wordprocessingGroup" xmlns:wpi="http://schemas.microsoft.com/office/word/2010/wordprocessingInk" xmlns:wne="http://schemas.microsoft.com/office/word/2006/wordml" xmlns:wps="http://schemas.microsoft.com/office/word/2010/wordprocessingShape" mc:Ignorable="w14 w15 w16se w16cid w16 w16cex w16sdtdh wp14">
+<w:ftr xmlns:wpc="http://schemas.microsoft.com/office/word/2010/wordprocessingCanvas" xmlns:cx="http://schemas.microsoft.com/office/drawing/2014/chartex" xmlns:cx1="http://schemas.microsoft.com/office/drawing/2015/9/8/chartex" xmlns:cx2="http://schemas.microsoft.com/office/drawing/2015/10/21/chartex" xmlns:cx3="http://schemas.microsoft.com/office/drawing/2016/5/9/chartex" xmlns:cx4="http://schemas.microsoft.com/office/drawing/2016/5/10/chartex" xmlns:cx5="http://schemas.microsoft.com/office/drawing/2016/5/11/chartex" xmlns:cx6="http://schemas.microsoft.com/office/drawing/2016/5/12/chartex" xmlns:cx7="http://schemas.microsoft.com/office/drawing/2016/5/13/chartex" xmlns:cx8="http://schemas.microsoft.com/office/drawing/2016/5/14/chartex" xmlns:mc="http://schemas.openxmlformats.org/markup-compatibility/2006" xmlns:aink="http://schemas.microsoft.com/office/drawing/2016/ink" xmlns:am3d="http://schemas.microsoft.com/office/drawing/2017/model3d" xmlns:o="urn:schemas-microsoft-com:office:office" xmlns:oel="http://schemas.microsoft.com/office/2019/extlst" xmlns:r="http://schemas.openxmlformats.org/officeDocument/2006/relationships" xmlns:m="http://schemas.openxmlformats.org/officeDocument/2006/math" xmlns:v="urn:schemas-microsoft-com:vml" xmlns:wp14="http://schemas.microsoft.com/office/word/2010/wordprocessingDrawing" xmlns:wp="http://schemas.openxmlformats.org/drawingml/2006/wordprocessingDrawing" xmlns:w10="urn:schemas-microsoft-com:office:word" xmlns:w="http://schemas.openxmlformats.org/wordprocessingml/2006/main" xmlns:w14="http://schemas.microsoft.com/office/word/2010/wordml" xmlns:w15="http://schemas.microsoft.com/office/word/2012/wordml" xmlns:w16cex="http://schemas.microsoft.com/office/word/2018/wordml/cex" xmlns:w16cid="http://schemas.microsoft.com/office/word/2016/wordml/cid" xmlns:w16="http://schemas.microsoft.com/office/word/2018/wordml" xmlns:w16sdtdh="http://schemas.microsoft.com/office/word/2020/wordml/sdtdatahash" xmlns:w16se="http://schemas.microsoft.com/office/word/2015/wordml/symex" xmlns:wpg="http://schemas.microsoft.com/office/word/2010/wordprocessingGroup" xmlns:wpi="http://schemas.microsoft.com/office/word/2010/wordprocessingInk" xmlns:wne="http://schemas.microsoft.com/office/word/2006/wordml" xmlns:wps="http://schemas.microsoft.com/office/word/2010/wordprocessingShape" mc:Ignorable="w14 w15 w16se w16cid w16 w16cex w16sdtdh wp14">
   <w:p>
     <w:pPr>
       <w:spacing w:line="360" w:lineRule="auto"/>
@@ -726,10 +568,10 @@
         <w:noProof/>
       </w:rPr>
       <w:drawing>
-        <wp:inline distT="0" distB="0" distL="0" distR="0" wp14:anchorId="32D19045" wp14:editId="2C98749E">
-          <wp:extent cx="2974251" cy="684000"/>
-          <wp:effectExtent l="0" t="0" r="0" b="1905"/>
-          <wp:docPr id="4" name="Imagen 2" descr="C:\Users\raquel.alvaro\Desktop\Captura.JPG"/>
+        <wp:inline distT="0" distB="0" distL="0" distR="0" wp14:anchorId="7C1E08C5" wp14:editId="2D4833EB">
+          <wp:extent cx="5400040" cy="946785"/>
+          <wp:effectExtent l="0" t="0" r="0" b="5715"/>
+          <wp:docPr id="1" name="Imagen 1"/>
           <wp:cNvGraphicFramePr>
             <a:graphicFrameLocks xmlns:a="http://schemas.openxmlformats.org/drawingml/2006/main" noChangeAspect="1"/>
           </wp:cNvGraphicFramePr>
@@ -737,27 +579,23 @@
             <a:graphicData uri="http://schemas.openxmlformats.org/drawingml/2006/picture">
               <pic:pic xmlns:pic="http://schemas.openxmlformats.org/drawingml/2006/picture">
                 <pic:nvPicPr>
-                  <pic:cNvPr id="0" name="Picture 1" descr="C:\Users\raquel.alvaro\Desktop\Captura.JPG"/>
-                  <pic:cNvPicPr>
-                    <a:picLocks noChangeAspect="1"/>
-                  </pic:cNvPicPr>
+                  <pic:cNvPr id="1" name=""/>
+                  <pic:cNvPicPr/>
                 </pic:nvPicPr>
                 <pic:blipFill>
                   <a:blip r:embed="rId1"/>
-                  <a:stretch/>
+                  <a:stretch>
+                    <a:fillRect/>
+                  </a:stretch>
                 </pic:blipFill>
-                <pic:spPr bwMode="auto">
+                <pic:spPr>
                   <a:xfrm>
                     <a:off x="0" y="0"/>
-                    <a:ext cx="2974251" cy="684000"/>
+                    <a:ext cx="5400040" cy="946785"/>
                   </a:xfrm>
                   <a:prstGeom prst="rect">
                     <a:avLst/>
                   </a:prstGeom>
-                  <a:noFill/>
-                  <a:ln>
-                    <a:noFill/>
-                  </a:ln>
                 </pic:spPr>
               </pic:pic>
             </a:graphicData>
@@ -770,7 +608,7 @@
 </file>
 
 <file path=word/footnotes.xml><?xml version="1.0" encoding="utf-8"?>
-<w:footnotes xmlns:wpc="http://schemas.microsoft.com/office/word/2010/wordprocessingCanvas" xmlns:cx="http://schemas.microsoft.com/office/drawing/2014/chartex" xmlns:cx1="http://schemas.microsoft.com/office/drawing/2015/9/8/chartex" xmlns:cx2="http://schemas.microsoft.com/office/drawing/2015/10/21/chartex" xmlns:cx3="http://schemas.microsoft.com/office/drawing/2016/5/9/chartex" xmlns:cx4="http://schemas.microsoft.com/office/drawing/2016/5/10/chartex" xmlns:cx5="http://schemas.microsoft.com/office/drawing/2016/5/11/chartex" xmlns:cx6="http://schemas.microsoft.com/office/drawing/2016/5/12/chartex" xmlns:cx7="http://schemas.microsoft.com/office/drawing/2016/5/13/chartex" xmlns:cx8="http://schemas.microsoft.com/office/drawing/2016/5/14/chartex" xmlns:mc="http://schemas.openxmlformats.org/markup-compatibility/2006" xmlns:aink="http://schemas.microsoft.com/office/drawing/2016/ink" xmlns:am3d="http://schemas.microsoft.com/office/drawing/2017/model3d" xmlns:o="urn:schemas-microsoft-com:office:office" xmlns:r="http://schemas.openxmlformats.org/officeDocument/2006/relationships" xmlns:m="http://schemas.openxmlformats.org/officeDocument/2006/math" xmlns:v="urn:schemas-microsoft-com:vml" xmlns:wp14="http://schemas.microsoft.com/office/word/2010/wordprocessingDrawing" xmlns:wp="http://schemas.openxmlformats.org/drawingml/2006/wordprocessingDrawing" xmlns:w10="urn:schemas-microsoft-com:office:word" xmlns:w="http://schemas.openxmlformats.org/wordprocessingml/2006/main" xmlns:w14="http://schemas.microsoft.com/office/word/2010/wordml" xmlns:w15="http://schemas.microsoft.com/office/word/2012/wordml" xmlns:w16cex="http://schemas.microsoft.com/office/word/2018/wordml/cex" xmlns:w16cid="http://schemas.microsoft.com/office/word/2016/wordml/cid" xmlns:w16="http://schemas.microsoft.com/office/word/2018/wordml" xmlns:w16sdtdh="http://schemas.microsoft.com/office/word/2020/wordml/sdtdatahash" xmlns:w16se="http://schemas.microsoft.com/office/word/2015/wordml/symex" xmlns:wpg="http://schemas.microsoft.com/office/word/2010/wordprocessingGroup" xmlns:wpi="http://schemas.microsoft.com/office/word/2010/wordprocessingInk" xmlns:wne="http://schemas.microsoft.com/office/word/2006/wordml" xmlns:wps="http://schemas.microsoft.com/office/word/2010/wordprocessingShape" mc:Ignorable="w14 w15 w16se w16cid w16 w16cex w16sdtdh wp14">
+<w:footnotes xmlns:wpc="http://schemas.microsoft.com/office/word/2010/wordprocessingCanvas" xmlns:cx="http://schemas.microsoft.com/office/drawing/2014/chartex" xmlns:cx1="http://schemas.microsoft.com/office/drawing/2015/9/8/chartex" xmlns:cx2="http://schemas.microsoft.com/office/drawing/2015/10/21/chartex" xmlns:cx3="http://schemas.microsoft.com/office/drawing/2016/5/9/chartex" xmlns:cx4="http://schemas.microsoft.com/office/drawing/2016/5/10/chartex" xmlns:cx5="http://schemas.microsoft.com/office/drawing/2016/5/11/chartex" xmlns:cx6="http://schemas.microsoft.com/office/drawing/2016/5/12/chartex" xmlns:cx7="http://schemas.microsoft.com/office/drawing/2016/5/13/chartex" xmlns:cx8="http://schemas.microsoft.com/office/drawing/2016/5/14/chartex" xmlns:mc="http://schemas.openxmlformats.org/markup-compatibility/2006" xmlns:aink="http://schemas.microsoft.com/office/drawing/2016/ink" xmlns:am3d="http://schemas.microsoft.com/office/drawing/2017/model3d" xmlns:o="urn:schemas-microsoft-com:office:office" xmlns:oel="http://schemas.microsoft.com/office/2019/extlst" xmlns:r="http://schemas.openxmlformats.org/officeDocument/2006/relationships" xmlns:m="http://schemas.openxmlformats.org/officeDocument/2006/math" xmlns:v="urn:schemas-microsoft-com:vml" xmlns:wp14="http://schemas.microsoft.com/office/word/2010/wordprocessingDrawing" xmlns:wp="http://schemas.openxmlformats.org/drawingml/2006/wordprocessingDrawing" xmlns:w10="urn:schemas-microsoft-com:office:word" xmlns:w="http://schemas.openxmlformats.org/wordprocessingml/2006/main" xmlns:w14="http://schemas.microsoft.com/office/word/2010/wordml" xmlns:w15="http://schemas.microsoft.com/office/word/2012/wordml" xmlns:w16cex="http://schemas.microsoft.com/office/word/2018/wordml/cex" xmlns:w16cid="http://schemas.microsoft.com/office/word/2016/wordml/cid" xmlns:w16="http://schemas.microsoft.com/office/word/2018/wordml" xmlns:w16sdtdh="http://schemas.microsoft.com/office/word/2020/wordml/sdtdatahash" xmlns:w16se="http://schemas.microsoft.com/office/word/2015/wordml/symex" xmlns:wpg="http://schemas.microsoft.com/office/word/2010/wordprocessingGroup" xmlns:wpi="http://schemas.microsoft.com/office/word/2010/wordprocessingInk" xmlns:wne="http://schemas.microsoft.com/office/word/2006/wordml" xmlns:wps="http://schemas.microsoft.com/office/word/2010/wordprocessingShape" mc:Ignorable="w14 w15 w16se w16cid w16 w16cex w16sdtdh wp14">
   <w:footnote w:type="separator" w:id="-1">
     <w:p>
       <w:r>
@@ -789,7 +627,7 @@
 </file>
 
 <file path=word/header1.xml><?xml version="1.0" encoding="utf-8"?>
-<w:hdr xmlns:wpc="http://schemas.microsoft.com/office/word/2010/wordprocessingCanvas" xmlns:cx="http://schemas.microsoft.com/office/drawing/2014/chartex" xmlns:cx1="http://schemas.microsoft.com/office/drawing/2015/9/8/chartex" xmlns:cx2="http://schemas.microsoft.com/office/drawing/2015/10/21/chartex" xmlns:cx3="http://schemas.microsoft.com/office/drawing/2016/5/9/chartex" xmlns:cx4="http://schemas.microsoft.com/office/drawing/2016/5/10/chartex" xmlns:cx5="http://schemas.microsoft.com/office/drawing/2016/5/11/chartex" xmlns:cx6="http://schemas.microsoft.com/office/drawing/2016/5/12/chartex" xmlns:cx7="http://schemas.microsoft.com/office/drawing/2016/5/13/chartex" xmlns:cx8="http://schemas.microsoft.com/office/drawing/2016/5/14/chartex" xmlns:mc="http://schemas.openxmlformats.org/markup-compatibility/2006" xmlns:aink="http://schemas.microsoft.com/office/drawing/2016/ink" xmlns:am3d="http://schemas.microsoft.com/office/drawing/2017/model3d" xmlns:o="urn:schemas-microsoft-com:office:office" xmlns:r="http://schemas.openxmlformats.org/officeDocument/2006/relationships" xmlns:m="http://schemas.openxmlformats.org/officeDocument/2006/math" xmlns:v="urn:schemas-microsoft-com:vml" xmlns:wp14="http://schemas.microsoft.com/office/word/2010/wordprocessingDrawing" xmlns:wp="http://schemas.openxmlformats.org/drawingml/2006/wordprocessingDrawing" xmlns:w10="urn:schemas-microsoft-com:office:word" xmlns:w="http://schemas.openxmlformats.org/wordprocessingml/2006/main" xmlns:w14="http://schemas.microsoft.com/office/word/2010/wordml" xmlns:w15="http://schemas.microsoft.com/office/word/2012/wordml" xmlns:w16cex="http://schemas.microsoft.com/office/word/2018/wordml/cex" xmlns:w16cid="http://schemas.microsoft.com/office/word/2016/wordml/cid" xmlns:w16="http://schemas.microsoft.com/office/word/2018/wordml" xmlns:w16sdtdh="http://schemas.microsoft.com/office/word/2020/wordml/sdtdatahash" xmlns:w16se="http://schemas.microsoft.com/office/word/2015/wordml/symex" xmlns:wpg="http://schemas.microsoft.com/office/word/2010/wordprocessingGroup" xmlns:wpi="http://schemas.microsoft.com/office/word/2010/wordprocessingInk" xmlns:wne="http://schemas.microsoft.com/office/word/2006/wordml" xmlns:wps="http://schemas.microsoft.com/office/word/2010/wordprocessingShape" mc:Ignorable="w14 w15 w16se w16cid w16 w16cex w16sdtdh wp14">
+<w:hdr xmlns:wpc="http://schemas.microsoft.com/office/word/2010/wordprocessingCanvas" xmlns:cx="http://schemas.microsoft.com/office/drawing/2014/chartex" xmlns:cx1="http://schemas.microsoft.com/office/drawing/2015/9/8/chartex" xmlns:cx2="http://schemas.microsoft.com/office/drawing/2015/10/21/chartex" xmlns:cx3="http://schemas.microsoft.com/office/drawing/2016/5/9/chartex" xmlns:cx4="http://schemas.microsoft.com/office/drawing/2016/5/10/chartex" xmlns:cx5="http://schemas.microsoft.com/office/drawing/2016/5/11/chartex" xmlns:cx6="http://schemas.microsoft.com/office/drawing/2016/5/12/chartex" xmlns:cx7="http://schemas.microsoft.com/office/drawing/2016/5/13/chartex" xmlns:cx8="http://schemas.microsoft.com/office/drawing/2016/5/14/chartex" xmlns:mc="http://schemas.openxmlformats.org/markup-compatibility/2006" xmlns:aink="http://schemas.microsoft.com/office/drawing/2016/ink" xmlns:am3d="http://schemas.microsoft.com/office/drawing/2017/model3d" xmlns:o="urn:schemas-microsoft-com:office:office" xmlns:oel="http://schemas.microsoft.com/office/2019/extlst" xmlns:r="http://schemas.openxmlformats.org/officeDocument/2006/relationships" xmlns:m="http://schemas.openxmlformats.org/officeDocument/2006/math" xmlns:v="urn:schemas-microsoft-com:vml" xmlns:wp14="http://schemas.microsoft.com/office/word/2010/wordprocessingDrawing" xmlns:wp="http://schemas.openxmlformats.org/drawingml/2006/wordprocessingDrawing" xmlns:w10="urn:schemas-microsoft-com:office:word" xmlns:w="http://schemas.openxmlformats.org/wordprocessingml/2006/main" xmlns:w14="http://schemas.microsoft.com/office/word/2010/wordml" xmlns:w15="http://schemas.microsoft.com/office/word/2012/wordml" xmlns:w16cex="http://schemas.microsoft.com/office/word/2018/wordml/cex" xmlns:w16cid="http://schemas.microsoft.com/office/word/2016/wordml/cid" xmlns:w16="http://schemas.microsoft.com/office/word/2018/wordml" xmlns:w16sdtdh="http://schemas.microsoft.com/office/word/2020/wordml/sdtdatahash" xmlns:w16se="http://schemas.microsoft.com/office/word/2015/wordml/symex" xmlns:wpg="http://schemas.microsoft.com/office/word/2010/wordprocessingGroup" xmlns:wpi="http://schemas.microsoft.com/office/word/2010/wordprocessingInk" xmlns:wne="http://schemas.microsoft.com/office/word/2006/wordml" xmlns:wps="http://schemas.microsoft.com/office/word/2010/wordprocessingShape" mc:Ignorable="w14 w15 w16se w16cid w16 w16cex w16sdtdh wp14">
   <w:tbl>
     <w:tblPr>
       <w:tblW w:w="8755" w:type="dxa"/>
@@ -1119,7 +957,7 @@
               <w:rFonts w:ascii="Calibri" w:hAnsi="Calibri" w:cs="Tahoma"/>
               <w:szCs w:val="20"/>
             </w:rPr>
-            <w:t>5</w:t>
+            <w:t>6</w:t>
           </w:r>
         </w:p>
         <w:p>
@@ -1143,7 +981,28 @@
               <w:rFonts w:ascii="Calibri" w:hAnsi="Calibri" w:cs="Tahoma"/>
               <w:szCs w:val="20"/>
             </w:rPr>
-            <w:t>21/01/2026</w:t>
+            <w:t>01</w:t>
+          </w:r>
+          <w:r>
+            <w:rPr>
+              <w:rFonts w:ascii="Calibri" w:hAnsi="Calibri" w:cs="Tahoma"/>
+              <w:szCs w:val="20"/>
+            </w:rPr>
+            <w:t>/</w:t>
+          </w:r>
+          <w:r>
+            <w:rPr>
+              <w:rFonts w:ascii="Calibri" w:hAnsi="Calibri" w:cs="Tahoma"/>
+              <w:szCs w:val="20"/>
+            </w:rPr>
+            <w:t>10</w:t>
+          </w:r>
+          <w:r>
+            <w:rPr>
+              <w:rFonts w:ascii="Calibri" w:hAnsi="Calibri" w:cs="Tahoma"/>
+              <w:szCs w:val="20"/>
+            </w:rPr>
+            <w:t>/2026</w:t>
           </w:r>
         </w:p>
         <w:p>
@@ -1271,7 +1130,7 @@
 </file>
 
 <file path=word/numbering.xml><?xml version="1.0" encoding="utf-8"?>
-<w:numbering xmlns:wpc="http://schemas.microsoft.com/office/word/2010/wordprocessingCanvas" xmlns:cx="http://schemas.microsoft.com/office/drawing/2014/chartex" xmlns:cx1="http://schemas.microsoft.com/office/drawing/2015/9/8/chartex" xmlns:cx2="http://schemas.microsoft.com/office/drawing/2015/10/21/chartex" xmlns:cx3="http://schemas.microsoft.com/office/drawing/2016/5/9/chartex" xmlns:cx4="http://schemas.microsoft.com/office/drawing/2016/5/10/chartex" xmlns:cx5="http://schemas.microsoft.com/office/drawing/2016/5/11/chartex" xmlns:cx6="http://schemas.microsoft.com/office/drawing/2016/5/12/chartex" xmlns:cx7="http://schemas.microsoft.com/office/drawing/2016/5/13/chartex" xmlns:cx8="http://schemas.microsoft.com/office/drawing/2016/5/14/chartex" xmlns:mc="http://schemas.openxmlformats.org/markup-compatibility/2006" xmlns:aink="http://schemas.microsoft.com/office/drawing/2016/ink" xmlns:am3d="http://schemas.microsoft.com/office/drawing/2017/model3d" xmlns:o="urn:schemas-microsoft-com:office:office" xmlns:r="http://schemas.openxmlformats.org/officeDocument/2006/relationships" xmlns:m="http://schemas.openxmlformats.org/officeDocument/2006/math" xmlns:v="urn:schemas-microsoft-com:vml" xmlns:wp14="http://schemas.microsoft.com/office/word/2010/wordprocessingDrawing" xmlns:wp="http://schemas.openxmlformats.org/drawingml/2006/wordprocessingDrawing" xmlns:w10="urn:schemas-microsoft-com:office:word" xmlns:w="http://schemas.openxmlformats.org/wordprocessingml/2006/main" xmlns:w14="http://schemas.microsoft.com/office/word/2010/wordml" xmlns:w15="http://schemas.microsoft.com/office/word/2012/wordml" xmlns:w16cex="http://schemas.microsoft.com/office/word/2018/wordml/cex" xmlns:w16cid="http://schemas.microsoft.com/office/word/2016/wordml/cid" xmlns:w16="http://schemas.microsoft.com/office/word/2018/wordml" xmlns:w16sdtdh="http://schemas.microsoft.com/office/word/2020/wordml/sdtdatahash" xmlns:w16se="http://schemas.microsoft.com/office/word/2015/wordml/symex" xmlns:wpg="http://schemas.microsoft.com/office/word/2010/wordprocessingGroup" xmlns:wpi="http://schemas.microsoft.com/office/word/2010/wordprocessingInk" xmlns:wne="http://schemas.microsoft.com/office/word/2006/wordml" xmlns:wps="http://schemas.microsoft.com/office/word/2010/wordprocessingShape" mc:Ignorable="w14 w15 w16se w16cid w16 w16cex w16sdtdh wp14">
+<w:numbering xmlns:wpc="http://schemas.microsoft.com/office/word/2010/wordprocessingCanvas" xmlns:cx="http://schemas.microsoft.com/office/drawing/2014/chartex" xmlns:cx1="http://schemas.microsoft.com/office/drawing/2015/9/8/chartex" xmlns:cx2="http://schemas.microsoft.com/office/drawing/2015/10/21/chartex" xmlns:cx3="http://schemas.microsoft.com/office/drawing/2016/5/9/chartex" xmlns:cx4="http://schemas.microsoft.com/office/drawing/2016/5/10/chartex" xmlns:cx5="http://schemas.microsoft.com/office/drawing/2016/5/11/chartex" xmlns:cx6="http://schemas.microsoft.com/office/drawing/2016/5/12/chartex" xmlns:cx7="http://schemas.microsoft.com/office/drawing/2016/5/13/chartex" xmlns:cx8="http://schemas.microsoft.com/office/drawing/2016/5/14/chartex" xmlns:mc="http://schemas.openxmlformats.org/markup-compatibility/2006" xmlns:aink="http://schemas.microsoft.com/office/drawing/2016/ink" xmlns:am3d="http://schemas.microsoft.com/office/drawing/2017/model3d" xmlns:o="urn:schemas-microsoft-com:office:office" xmlns:oel="http://schemas.microsoft.com/office/2019/extlst" xmlns:r="http://schemas.openxmlformats.org/officeDocument/2006/relationships" xmlns:m="http://schemas.openxmlformats.org/officeDocument/2006/math" xmlns:v="urn:schemas-microsoft-com:vml" xmlns:wp14="http://schemas.microsoft.com/office/word/2010/wordprocessingDrawing" xmlns:wp="http://schemas.openxmlformats.org/drawingml/2006/wordprocessingDrawing" xmlns:w10="urn:schemas-microsoft-com:office:word" xmlns:w="http://schemas.openxmlformats.org/wordprocessingml/2006/main" xmlns:w14="http://schemas.microsoft.com/office/word/2010/wordml" xmlns:w15="http://schemas.microsoft.com/office/word/2012/wordml" xmlns:w16cex="http://schemas.microsoft.com/office/word/2018/wordml/cex" xmlns:w16cid="http://schemas.microsoft.com/office/word/2016/wordml/cid" xmlns:w16="http://schemas.microsoft.com/office/word/2018/wordml" xmlns:w16sdtdh="http://schemas.microsoft.com/office/word/2020/wordml/sdtdatahash" xmlns:w16se="http://schemas.microsoft.com/office/word/2015/wordml/symex" xmlns:wpg="http://schemas.microsoft.com/office/word/2010/wordprocessingGroup" xmlns:wpi="http://schemas.microsoft.com/office/word/2010/wordprocessingInk" xmlns:wne="http://schemas.microsoft.com/office/word/2006/wordml" xmlns:wps="http://schemas.microsoft.com/office/word/2010/wordprocessingShape" mc:Ignorable="w14 w15 w16se w16cid w16 w16cex w16sdtdh wp14">
   <w:abstractNum w:abstractNumId="0" w15:restartNumberingAfterBreak="0">
     <w:nsid w:val="0408457B"/>
     <w:multiLevelType w:val="hybridMultilevel"/>
@@ -4271,70 +4130,70 @@
       </w:rPr>
     </w:lvl>
   </w:abstractNum>
-  <w:num w:numId="1">
+  <w:num w:numId="1" w16cid:durableId="1320812931">
     <w:abstractNumId w:val="20"/>
   </w:num>
-  <w:num w:numId="2">
+  <w:num w:numId="2" w16cid:durableId="1853647720">
     <w:abstractNumId w:val="15"/>
   </w:num>
-  <w:num w:numId="3">
+  <w:num w:numId="3" w16cid:durableId="2003465048">
     <w:abstractNumId w:val="18"/>
   </w:num>
-  <w:num w:numId="4">
+  <w:num w:numId="4" w16cid:durableId="974141346">
     <w:abstractNumId w:val="1"/>
   </w:num>
-  <w:num w:numId="5">
+  <w:num w:numId="5" w16cid:durableId="542256796">
     <w:abstractNumId w:val="3"/>
   </w:num>
-  <w:num w:numId="6">
+  <w:num w:numId="6" w16cid:durableId="755906516">
     <w:abstractNumId w:val="7"/>
   </w:num>
-  <w:num w:numId="7">
+  <w:num w:numId="7" w16cid:durableId="1842815425">
     <w:abstractNumId w:val="12"/>
   </w:num>
-  <w:num w:numId="8">
+  <w:num w:numId="8" w16cid:durableId="1721008062">
     <w:abstractNumId w:val="4"/>
   </w:num>
-  <w:num w:numId="9">
+  <w:num w:numId="9" w16cid:durableId="1565607775">
     <w:abstractNumId w:val="21"/>
   </w:num>
-  <w:num w:numId="10">
+  <w:num w:numId="10" w16cid:durableId="138965486">
     <w:abstractNumId w:val="19"/>
   </w:num>
-  <w:num w:numId="11">
+  <w:num w:numId="11" w16cid:durableId="1283537429">
     <w:abstractNumId w:val="8"/>
   </w:num>
-  <w:num w:numId="12">
+  <w:num w:numId="12" w16cid:durableId="1582444025">
     <w:abstractNumId w:val="9"/>
   </w:num>
-  <w:num w:numId="13">
+  <w:num w:numId="13" w16cid:durableId="256910793">
     <w:abstractNumId w:val="6"/>
   </w:num>
-  <w:num w:numId="14">
+  <w:num w:numId="14" w16cid:durableId="1700232151">
     <w:abstractNumId w:val="5"/>
   </w:num>
-  <w:num w:numId="15">
+  <w:num w:numId="15" w16cid:durableId="1002398087">
     <w:abstractNumId w:val="0"/>
   </w:num>
-  <w:num w:numId="16">
+  <w:num w:numId="16" w16cid:durableId="1489595799">
     <w:abstractNumId w:val="10"/>
   </w:num>
-  <w:num w:numId="17">
+  <w:num w:numId="17" w16cid:durableId="1978142729">
     <w:abstractNumId w:val="13"/>
   </w:num>
-  <w:num w:numId="18">
+  <w:num w:numId="18" w16cid:durableId="454715729">
     <w:abstractNumId w:val="14"/>
   </w:num>
-  <w:num w:numId="19">
+  <w:num w:numId="19" w16cid:durableId="89014717">
     <w:abstractNumId w:val="17"/>
   </w:num>
-  <w:num w:numId="20">
+  <w:num w:numId="20" w16cid:durableId="2028798392">
     <w:abstractNumId w:val="2"/>
   </w:num>
-  <w:num w:numId="21">
+  <w:num w:numId="21" w16cid:durableId="1735157122">
     <w:abstractNumId w:val="16"/>
   </w:num>
-  <w:num w:numId="22">
+  <w:num w:numId="22" w16cid:durableId="518854202">
     <w:abstractNumId w:val="11"/>
   </w:num>
 </w:numbering>
@@ -16146,27 +16005,27 @@
 </file>
 
 <file path=customXml/item1.xml><?xml version="1.0" encoding="utf-8"?>
+<b:Sources xmlns:b="http://schemas.openxmlformats.org/officeDocument/2006/bibliography" xmlns="http://schemas.openxmlformats.org/officeDocument/2006/bibliography" SelectedStyle="/APA.XSL" StyleName="APA"/>
+</file>
+
+<file path=customXml/item2.xml><?xml version="1.0" encoding="utf-8"?>
 <w:settings xmlns:w="http://schemas.openxmlformats.org/wordprocessingml/2006/main">
   <w:SpecialFormsHighlight w:val="c9c8ff"/>
 </w:settings>
 </file>
 
-<file path=customXml/item2.xml><?xml version="1.0" encoding="utf-8"?>
-<b:Sources xmlns:b="http://schemas.openxmlformats.org/officeDocument/2006/bibliography" xmlns="http://schemas.openxmlformats.org/officeDocument/2006/bibliography" SelectedStyle="/APA.XSL" StyleName="APA"/>
+<file path=customXml/itemProps1.xml><?xml version="1.0" encoding="utf-8"?>
+<ds:datastoreItem xmlns:ds="http://schemas.openxmlformats.org/officeDocument/2006/customXml" ds:itemID="{CD7A5107-0FC0-41E6-BCF9-E2C5CEA1A1A8}">
+  <ds:schemaRefs>
+    <ds:schemaRef ds:uri="http://schemas.openxmlformats.org/officeDocument/2006/bibliography"/>
+  </ds:schemaRefs>
+</ds:datastoreItem>
 </file>
 
-<file path=customXml/itemProps1.xml><?xml version="1.0" encoding="utf-8"?>
+<file path=customXml/itemProps2.xml><?xml version="1.0" encoding="utf-8"?>
 <ds:datastoreItem xmlns:ds="http://schemas.openxmlformats.org/officeDocument/2006/customXml" ds:itemID="{5D0AEA6B-E499-4EEF-98A3-AFBB261C493E}">
   <ds:schemaRefs>
     <ds:schemaRef ds:uri="http://schemas.openxmlformats.org/wordprocessingml/2006/main"/>
   </ds:schemaRefs>
 </ds:datastoreItem>
-</file>
-
-<file path=customXml/itemProps2.xml><?xml version="1.0" encoding="utf-8"?>
-<ds:datastoreItem xmlns:ds="http://schemas.openxmlformats.org/officeDocument/2006/customXml" ds:itemID="{CD7A5107-0FC0-41E6-BCF9-E2C5CEA1A1A8}">
-  <ds:schemaRefs>
-    <ds:schemaRef ds:uri="http://schemas.openxmlformats.org/officeDocument/2006/bibliography"/>
-  </ds:schemaRefs>
-</ds:datastoreItem>
 </file>
</xml_diff>